<commit_message>
working on TP customer statistics report and added quote type field in sales quote archive
</commit_message>
<xml_diff>
--- a/src/Layouts/Customer.docx
+++ b/src/Layouts/Customer.docx
@@ -6853,6 +6853,20 @@
  
  < N a v W o r d R e p o r t X m l P a r t   x m l n s = " u r n : m i c r o s o f t - d y n a m i c s - b u s i n e s s c e n t r a l / i n t e r n a l / e x t e n d e d / r e p o r t s / T P _ C u s t o m e r _ S t a t i s t i c s / 7 0 1 0 1 / " >   
+     < L a b e l s > + 
+         < D a y s S i n c e L a s t S a l e C a p t i o n   E l e m e n t T y p e = " P a r a m e t e r "   E l e m e n t I d = " 9 1 5 6 9 8 9 2 7 "   D a t a T y p e = " S t r i n g " > D a y s S i n c e L a s t S a l e C a p t i o n < / D a y s S i n c e L a s t S a l e C a p t i o n > + 
+         < I t e m N o C a p t i o n   E l e m e n t T y p e = " P a r a m e t e r "   E l e m e n t I d = " 1 8 1 4 6 8 1 6 3 1 "   D a t a T y p e = " S t r i n g " > I t e m N o C a p t i o n < / I t e m N o C a p t i o n > + 
+         < L a s t S a l e D a t e C a p t i o n   E l e m e n t T y p e = " P a r a m e t e r "   E l e m e n t I d = " 1 3 4 2 6 1 1 5 2 8 "   D a t a T y p e = " S t r i n g " > L a s t S a l e D a t e C a p t i o n < / L a s t S a l e D a t e C a p t i o n > + 
+         < R e s u l t D e s c r i p t i o n C a p t i o n   E l e m e n t T y p e = " P a r a m e t e r "   E l e m e n t I d = " 8 0 5 7 8 8 0 1 0 "   D a t a T y p e = " S t r i n g " > R e s u l t D e s c r i p t i o n C a p t i o n < / R e s u l t D e s c r i p t i o n C a p t i o n > + 
+         < R e s u l t T o t a l S a l e s A m o u n t C a p t i o n   E l e m e n t T y p e = " P a r a m e t e r "   E l e m e n t I d = " 1 8 3 5 5 0 9 6 8 6 "   D a t a T y p e = " S t r i n g " > R e s u l t T o t a l S a l e s A m o u n t C a p t i o n < / R e s u l t T o t a l S a l e s A m o u n t C a p t i o n > + 
+     < / L a b e l s > + 
      < T o o l t i p s >   
          < T o o l t i p   c o l u m n = " N a m e "   E l e m e n t I d = " 8 1 4 0 6 8 7 0 6 " > @@ -7012,6 +7026,20 @@
              < U n i t P r i c e 3   E l e m e n t T y p e = " C o l u m n "   E l e m e n t I d = " 6 6 1 7 5 3 3 2 5 "   D a t a T y p e = " D e c i m a l " > U n i t P r i c e 3 < / U n i t P r i c e 3 >   
          < / s a l e s i n v o i c e l i n e 3 > + 
+         < R e s u l t 1   E l e m e n t T y p e = " D a t a I t e m "   E l e m e n t I d = " 1 3 8 6 7 6 8 8 5 3 " > + 
+             < D a y s S i n c e L a s t S a l e   E l e m e n t T y p e = " C o l u m n "   E l e m e n t I d = " 9 1 5 6 9 8 9 2 7 "   D a t a T y p e = " I n t e g e r " > D a y s S i n c e L a s t S a l e < / D a y s S i n c e L a s t S a l e > + 
+             < I t e m N o   E l e m e n t T y p e = " C o l u m n "   E l e m e n t I d = " 1 8 1 4 6 8 1 6 3 1 "   D a t a T y p e = " C o d e " > I t e m N o < / I t e m N o > + 
+             < L a s t S a l e D a t e   E l e m e n t T y p e = " C o l u m n "   E l e m e n t I d = " 1 3 4 2 6 1 1 5 2 8 "   D a t a T y p e = " D a t e " > L a s t S a l e D a t e < / L a s t S a l e D a t e > + 
+             < R e s u l t D e s c r i p t i o n   E l e m e n t T y p e = " C o l u m n "   E l e m e n t I d = " 8 0 5 7 8 8 0 1 0 "   D a t a T y p e = " T e x t " > R e s u l t D e s c r i p t i o n < / R e s u l t D e s c r i p t i o n > + 
+             < R e s u l t T o t a l S a l e s A m o u n t   E l e m e n t T y p e = " C o l u m n "   E l e m e n t I d = " 1 8 3 5 5 0 9 6 8 6 "   D a t a T y p e = " D e c i m a l " > R e s u l t T o t a l S a l e s A m o u n t < / R e s u l t T o t a l S a l e s A m o u n t > + 
+         < / R e s u l t 1 >   
      < / C u s t o m e r >   
@@ -7022,6 +7050,20 @@
  
  < N a v W o r d R e p o r t X m l P a r t   x m l n s = " u r n : m i c r o s o f t - d y n a m i c s - n a v / r e p o r t s / T P _ C u s t o m e r _ S t a t i s t i c s / 7 0 1 0 1 / " >   
+     < L a b e l s > + 
+         < D a y s S i n c e L a s t S a l e C a p t i o n > D a y s S i n c e L a s t S a l e C a p t i o n < / D a y s S i n c e L a s t S a l e C a p t i o n > + 
+         < I t e m N o C a p t i o n > I t e m N o C a p t i o n < / I t e m N o C a p t i o n > + 
+         < L a s t S a l e D a t e C a p t i o n > L a s t S a l e D a t e C a p t i o n < / L a s t S a l e D a t e C a p t i o n > + 
+         < R e s u l t D e s c r i p t i o n C a p t i o n > R e s u l t D e s c r i p t i o n C a p t i o n < / R e s u l t D e s c r i p t i o n C a p t i o n > + 
+         < R e s u l t T o t a l S a l e s A m o u n t C a p t i o n > R e s u l t T o t a l S a l e s A m o u n t C a p t i o n < / R e s u l t T o t a l S a l e s A m o u n t C a p t i o n > + 
+     < / L a b e l s > + 
      < C u s t o m e r >   
          < A d d r e s s > A d d r e s s < / A d d r e s s > @@ -7123,6 +7165,20 @@
              < U n i t P r i c e 3 > U n i t P r i c e 3 < / U n i t P r i c e 3 >   
          < / s a l e s i n v o i c e l i n e 3 > + 
+         < R e s u l t 1 > + 
+             < D a y s S i n c e L a s t S a l e > D a y s S i n c e L a s t S a l e < / D a y s S i n c e L a s t S a l e > + 
+             < I t e m N o > I t e m N o < / I t e m N o > + 
+             < L a s t S a l e D a t e > L a s t S a l e D a t e < / L a s t S a l e D a t e > + 
+             < R e s u l t D e s c r i p t i o n > R e s u l t D e s c r i p t i o n < / R e s u l t D e s c r i p t i o n > + 
+             < R e s u l t T o t a l S a l e s A m o u n t > R e s u l t T o t a l S a l e s A m o u n t < / R e s u l t T o t a l S a l e s A m o u n t > + 
+         < / R e s u l t 1 >   
      < / C u s t o m e r >   

</xml_diff>

<commit_message>
Backorder Qty working fine and TP customer Statistics
</commit_message>
<xml_diff>
--- a/src/Layouts/Customer.docx
+++ b/src/Layouts/Customer.docx
@@ -6853,20 +6853,6 @@
  
  < N a v W o r d R e p o r t X m l P a r t   x m l n s = " u r n : m i c r o s o f t - d y n a m i c s - b u s i n e s s c e n t r a l / i n t e r n a l / e x t e n d e d / r e p o r t s / T P _ C u s t o m e r _ S t a t i s t i c s / 7 0 1 0 1 / " >   
-     < L a b e l s > - 
-         < D a y s S i n c e L a s t S a l e C a p t i o n   E l e m e n t T y p e = " P a r a m e t e r "   E l e m e n t I d = " 9 1 5 6 9 8 9 2 7 "   D a t a T y p e = " S t r i n g " > D a y s S i n c e L a s t S a l e C a p t i o n < / D a y s S i n c e L a s t S a l e C a p t i o n > - 
-         < I t e m N o C a p t i o n   E l e m e n t T y p e = " P a r a m e t e r "   E l e m e n t I d = " 1 8 1 4 6 8 1 6 3 1 "   D a t a T y p e = " S t r i n g " > I t e m N o C a p t i o n < / I t e m N o C a p t i o n > - 
-         < L a s t S a l e D a t e C a p t i o n   E l e m e n t T y p e = " P a r a m e t e r "   E l e m e n t I d = " 1 3 4 2 6 1 1 5 2 8 "   D a t a T y p e = " S t r i n g " > L a s t S a l e D a t e C a p t i o n < / L a s t S a l e D a t e C a p t i o n > - 
-         < R e s u l t D e s c r i p t i o n C a p t i o n   E l e m e n t T y p e = " P a r a m e t e r "   E l e m e n t I d = " 8 0 5 7 8 8 0 1 0 "   D a t a T y p e = " S t r i n g " > R e s u l t D e s c r i p t i o n C a p t i o n < / R e s u l t D e s c r i p t i o n C a p t i o n > - 
-         < R e s u l t T o t a l S a l e s A m o u n t C a p t i o n   E l e m e n t T y p e = " P a r a m e t e r "   E l e m e n t I d = " 1 8 3 5 5 0 9 6 8 6 "   D a t a T y p e = " S t r i n g " > R e s u l t T o t a l S a l e s A m o u n t C a p t i o n < / R e s u l t T o t a l S a l e s A m o u n t C a p t i o n > - 
-     < / L a b e l s > - 
      < T o o l t i p s >   
          < T o o l t i p   c o l u m n = " N a m e "   E l e m e n t I d = " 8 1 4 0 6 8 7 0 6 " > @@ -7026,20 +7012,6 @@
              < U n i t P r i c e 3   E l e m e n t T y p e = " C o l u m n "   E l e m e n t I d = " 6 6 1 7 5 3 3 2 5 "   D a t a T y p e = " D e c i m a l " > U n i t P r i c e 3 < / U n i t P r i c e 3 >   
          < / s a l e s i n v o i c e l i n e 3 > - 
-         < R e s u l t 1   E l e m e n t T y p e = " D a t a I t e m "   E l e m e n t I d = " 1 3 8 6 7 6 8 8 5 3 " > - 
-             < D a y s S i n c e L a s t S a l e   E l e m e n t T y p e = " C o l u m n "   E l e m e n t I d = " 9 1 5 6 9 8 9 2 7 "   D a t a T y p e = " I n t e g e r " > D a y s S i n c e L a s t S a l e < / D a y s S i n c e L a s t S a l e > - 
-             < I t e m N o   E l e m e n t T y p e = " C o l u m n "   E l e m e n t I d = " 1 8 1 4 6 8 1 6 3 1 "   D a t a T y p e = " C o d e " > I t e m N o < / I t e m N o > - 
-             < L a s t S a l e D a t e   E l e m e n t T y p e = " C o l u m n "   E l e m e n t I d = " 1 3 4 2 6 1 1 5 2 8 "   D a t a T y p e = " D a t e " > L a s t S a l e D a t e < / L a s t S a l e D a t e > - 
-             < R e s u l t D e s c r i p t i o n   E l e m e n t T y p e = " C o l u m n "   E l e m e n t I d = " 8 0 5 7 8 8 0 1 0 "   D a t a T y p e = " T e x t " > R e s u l t D e s c r i p t i o n < / R e s u l t D e s c r i p t i o n > - 
-             < R e s u l t T o t a l S a l e s A m o u n t   E l e m e n t T y p e = " C o l u m n "   E l e m e n t I d = " 1 8 3 5 5 0 9 6 8 6 "   D a t a T y p e = " D e c i m a l " > R e s u l t T o t a l S a l e s A m o u n t < / R e s u l t T o t a l S a l e s A m o u n t > - 
-         < / R e s u l t 1 >   
      < / C u s t o m e r >   
@@ -7050,20 +7022,6 @@
  
  < N a v W o r d R e p o r t X m l P a r t   x m l n s = " u r n : m i c r o s o f t - d y n a m i c s - n a v / r e p o r t s / T P _ C u s t o m e r _ S t a t i s t i c s / 7 0 1 0 1 / " >   
-     < L a b e l s > - 
-         < D a y s S i n c e L a s t S a l e C a p t i o n > D a y s S i n c e L a s t S a l e C a p t i o n < / D a y s S i n c e L a s t S a l e C a p t i o n > - 
-         < I t e m N o C a p t i o n > I t e m N o C a p t i o n < / I t e m N o C a p t i o n > - 
-         < L a s t S a l e D a t e C a p t i o n > L a s t S a l e D a t e C a p t i o n < / L a s t S a l e D a t e C a p t i o n > - 
-         < R e s u l t D e s c r i p t i o n C a p t i o n > R e s u l t D e s c r i p t i o n C a p t i o n < / R e s u l t D e s c r i p t i o n C a p t i o n > - 
-         < R e s u l t T o t a l S a l e s A m o u n t C a p t i o n > R e s u l t T o t a l S a l e s A m o u n t C a p t i o n < / R e s u l t T o t a l S a l e s A m o u n t C a p t i o n > - 
-     < / L a b e l s > - 
      < C u s t o m e r >   
          < A d d r e s s > A d d r e s s < / A d d r e s s > @@ -7165,20 +7123,6 @@
              < U n i t P r i c e 3 > U n i t P r i c e 3 < / U n i t P r i c e 3 >   
          < / s a l e s i n v o i c e l i n e 3 > - 
-         < R e s u l t 1 > - 
-             < D a y s S i n c e L a s t S a l e > D a y s S i n c e L a s t S a l e < / D a y s S i n c e L a s t S a l e > - 
-             < I t e m N o > I t e m N o < / I t e m N o > - 
-             < L a s t S a l e D a t e > L a s t S a l e D a t e < / L a s t S a l e D a t e > - 
-             < R e s u l t D e s c r i p t i o n > R e s u l t D e s c r i p t i o n < / R e s u l t D e s c r i p t i o n > - 
-             < R e s u l t T o t a l S a l e s A m o u n t > R e s u l t T o t a l S a l e s A m o u n t < / R e s u l t T o t a l S a l e s A m o u n t > - 
-         < / R e s u l t 1 >   
      < / C u s t o m e r >   

</xml_diff>

<commit_message>
TP Customer staistics QRTR sales fields updated correctly
</commit_message>
<xml_diff>
--- a/src/Layouts/Customer.docx
+++ b/src/Layouts/Customer.docx
@@ -34,6 +34,8 @@
  
          < C u s t o m e r G r a d e > C u s t o m e r G r a d e < / C u s t o m e r G r a d e >   
+         < C u s t o m e r _ G r a d e > C u s t o m e r _ G r a d e < / C u s t o m e r _ G r a d e > + 
          < E M a i l > E M a i l < / E M a i l >   
          < L a s t Q r t r S a l e s A m o u n t > L a s t Q r t r S a l e s A m o u n t < / L a s t Q r t r S a l e s A m o u n t > @@ -203,6 +205,8 @@
  
          < C u s t o m e r G r a d e   E l e m e n t T y p e = " C o l u m n "   E l e m e n t I d = " 4 8 4 1 3 1 5 9 6 "   D a t a T y p e = " C o d e " > C u s t o m e r G r a d e < / C u s t o m e r G r a d e >   
+         < C u s t o m e r _ G r a d e   E l e m e n t T y p e = " C o l u m n "   E l e m e n t I d = " 1 3 6 1 0 1 2 0 1 9 "   D a t a T y p e = " C o d e " > C u s t o m e r _ G r a d e < / C u s t o m e r _ G r a d e > + 
          < E M a i l   E l e m e n t T y p e = " C o l u m n "   E l e m e n t I d = " 6 7 4 8 6 3 5 3 5 "   D a t a T y p e = " T e x t " > E M a i l < / E M a i l >   
          < L a s t Q r t r S a l e s A m o u n t   E l e m e n t T y p e = " C o l u m n "   E l e m e n t I d = " 1 5 2 6 9 6 1 5 4 2 "   D a t a T y p e = " D e c i m a l " > L a s t Q r t r S a l e s A m o u n t < / L a s t Q r t r S a l e s A m o u n t > 
</xml_diff>

<commit_message>
New fields added to TP customer statistics
</commit_message>
<xml_diff>
--- a/src/Layouts/Customer.docx
+++ b/src/Layouts/Customer.docx
@@ -6855,6 +6855,12 @@
  
      < T o o l t i p s >   
+         < T o o l t i p   c o l u m n = " N o _ "   E l e m e n t I d = " 1 0 8 0 6 9 1 2 5 3 " > + 
+             < T o o l t i p T e x t   l a n g = " e n - U S " > S p e c i f i e s   t h e   n u m b e r   o f   t h e   c u s t o m e r .   T h e   f i e l d   i s   e i t h e r   f i l l e d   a u t o m a t i c a l l y   f r o m   a   d e f i n e d   n u m b e r   s e r i e s ,   o r   y o u   e n t e r   t h e   n u m b e r   m a n u a l l y   b e c a u s e   y o u   h a v e   e n a b l e d   m a n u a l   n u m b e r   e n t r y   i n   t h e   n u m b e r - s e r i e s   s e t u p . < / T o o l t i p T e x t > + 
+         < / T o o l t i p > + 
          < T o o l t i p   c o l u m n = " N a m e "   E l e m e n t I d = " 8 1 4 0 6 8 7 0 6 " >   
              < T o o l t i p T e x t   l a n g = " e n - U S " > S p e c i f i e s   t h e   c u s t o m e r ' s   n a m e   t h a t   a p p e a r s   o n   a l l   r e l a t e d   d o c u m e n t s .   F o r   c o m p a n i e s ,   s p e c i f y   t h e   c o m p a n y ' s   n a m e   h e r e ,   a n d   t h e n   a d d   t h e   r e l e v a n t   p e o p l e   a s   c o n t a c t s   t h a t   y o u   l i n k   t o   t h i s   c u s t o m e r . < / T o o l t i p T e x t > @@ -6891,6 +6897,12 @@
  
          < / T o o l t i p >   
+         < T o o l t i p   c o l u m n = " S a l e s p e r s o n _ C o d e "   E l e m e n t I d = " 3 1 1 2 3 3 8 7 8 " > + 
+             < T o o l t i p T e x t   l a n g = " e n - U S " > S p e c i f i e s   a   c o d e   f o r   t h e   s a l e s p e r s o n   w h o   n o r m a l l y   h a n d l e s   t h i s   c u s t o m e r ' s   a c c o u n t . < / T o o l t i p T e x t > + 
+         < / T o o l t i p > + 
          < T o o l t i p   c o l u m n = " E M a i l "   E l e m e n t I d = " 6 7 4 8 6 3 5 3 5 " >   
              < T o o l t i p T e x t   l a n g = " e n - U S " > S p e c i f i e s   t h e   c u s t o m e r ' s   e m a i l   a d d r e s s . < / T o o l t i p T e x t > @@ -6935,9 +6947,13 @@
  
          < N a m e   E l e m e n t T y p e = " C o l u m n "   E l e m e n t I d = " 8 1 4 0 6 8 7 0 6 "   D a t a T y p e = " T e x t " > N a m e < / N a m e >   
+         < N o _   E l e m e n t T y p e = " C o l u m n "   E l e m e n t I d = " 1 0 8 0 6 9 1 2 5 3 "   D a t a T y p e = " C o d e " > N o _ < / N o _ > + 
          < P h o n e N o   E l e m e n t T y p e = " C o l u m n "   E l e m e n t I d = " 9 3 2 6 9 3 4 3 2 "   D a t a T y p e = " T e x t " > P h o n e N o < / P h o n e N o >   
          < P o s t C o d e   E l e m e n t T y p e = " C o l u m n "   E l e m e n t I d = " 1 2 2 6 9 1 4 8 0 8 "   D a t a T y p e = " C o d e " > P o s t C o d e < / P o s t C o d e > + 
+         < S a l e s p e r s o n _ C o d e   E l e m e n t T y p e = " C o l u m n "   E l e m e n t I d = " 3 1 1 2 3 3 8 7 8 "   D a t a T y p e = " C o d e " > S a l e s p e r s o n _ C o d e < / S a l e s p e r s o n _ C o d e >   
          < T h i s Q r t r S a l e s A m o u n t   E l e m e n t T y p e = " C o l u m n "   E l e m e n t I d = " 1 2 5 5 1 5 6 9 6 6 "   D a t a T y p e = " D e c i m a l " > T h i s Q r t r S a l e s A m o u n t < / T h i s Q r t r S a l e s A m o u n t >   
@@ -7046,9 +7062,13 @@
  
          < N a m e > N a m e < / N a m e >   
+         < N o _ > N o _ < / N o _ > + 
          < P h o n e N o > P h o n e N o < / P h o n e N o >   
          < P o s t C o d e > P o s t C o d e < / P o s t C o d e > + 
+         < S a l e s p e r s o n _ C o d e > S a l e s p e r s o n _ C o d e < / S a l e s p e r s o n _ C o d e >   
          < T h i s Q r t r S a l e s A m o u n t > T h i s Q r t r S a l e s A m o u n t < / T h i s Q r t r S a l e s A m o u n t >   

</xml_diff>

<commit_message>
New Fields added to TP customer statistics report and Receiving address fields added to Location card
</commit_message>
<xml_diff>
--- a/src/Layouts/Customer.docx
+++ b/src/Layouts/Customer.docx
@@ -46,9 +46,13 @@
  
          < N a m e > N a m e < / N a m e >   
+         < N o _ > N o _ < / N o _ > + 
          < P h o n e N o > P h o n e N o < / P h o n e N o >   
          < P o s t C o d e > P o s t C o d e < / P o s t C o d e > + 
+         < S a l e s p e r s o n _ C o d e > S a l e s p e r s o n _ C o d e < / S a l e s p e r s o n _ C o d e >   
          < T h i s Q r t r S a l e s A m o u n t > T h i s Q r t r S a l e s A m o u n t < / T h i s Q r t r S a l e s A m o u n t >   
@@ -141,6 +145,18 @@
  
          < / T o o l t i p >   
+         < T o o l t i p   c o l u m n = " N o _ "   E l e m e n t I d = " 1 0 8 0 6 9 1 2 5 3 " > + 
+             < T o o l t i p T e x t   l a n g = " e n - U S " > S p e c i f i e s   t h e   n u m b e r   o f   t h e   c u s t o m e r .   T h e   f i e l d   i s   e i t h e r   f i l l e d   a u t o m a t i c a l l y   f r o m   a   d e f i n e d   n u m b e r   s e r i e s ,   o r   y o u   e n t e r   t h e   n u m b e r   m a n u a l l y   b e c a u s e   y o u   h a v e   e n a b l e d   m a n u a l   n u m b e r   e n t r y   i n   t h e   n u m b e r - s e r i e s   s e t u p . < / T o o l t i p T e x t > + 
+         < / T o o l t i p > + 
+         < T o o l t i p   c o l u m n = " S a l e s p e r s o n _ C o d e "   E l e m e n t I d = " 3 1 1 2 3 3 8 7 8 " > + 
+             < T o o l t i p T e x t   l a n g = " e n - U S " > S p e c i f i e s   a   c o d e   f o r   t h e   s a l e s p e r s o n   w h o   n o r m a l l y   h a n d l e s   t h i s   c u s t o m e r ' s   a c c o u n t . < / T o o l t i p T e x t > + 
+         < / T o o l t i p > + 
          < T o o l t i p   c o l u m n = " A d d r e s s "   E l e m e n t I d = " 1 0 2 0 9 6 0 6 9 1 " >   
              < T o o l t i p T e x t   l a n g = " e n - U S " > S p e c i f i e s   t h e   c u s t o m e r ' s   a d d r e s s .   T h i s   a d d r e s s   w i l l   a p p e a r   o n   a l l   s a l e s   d o c u m e n t s   f o r   t h e   c u s t o m e r . < / T o o l t i p T e x t > @@ -217,9 +233,13 @@
  
          < N a m e   E l e m e n t T y p e = " C o l u m n "   E l e m e n t I d = " 8 1 4 0 6 8 7 0 6 "   D a t a T y p e = " T e x t " > N a m e < / N a m e >   
+         < N o _   E l e m e n t T y p e = " C o l u m n "   E l e m e n t I d = " 1 0 8 0 6 9 1 2 5 3 "   D a t a T y p e = " C o d e " > N o _ < / N o _ > + 
          < P h o n e N o   E l e m e n t T y p e = " C o l u m n "   E l e m e n t I d = " 9 3 2 6 9 3 4 3 2 "   D a t a T y p e = " T e x t " > P h o n e N o < / P h o n e N o >   
          < P o s t C o d e   E l e m e n t T y p e = " C o l u m n "   E l e m e n t I d = " 1 2 2 6 9 1 4 8 0 8 "   D a t a T y p e = " C o d e " > P o s t C o d e < / P o s t C o d e > + 
+         < S a l e s p e r s o n _ C o d e   E l e m e n t T y p e = " C o l u m n "   E l e m e n t I d = " 3 1 1 2 3 3 8 7 8 "   D a t a T y p e = " C o d e " > S a l e s p e r s o n _ C o d e < / S a l e s p e r s o n _ C o d e >   
          < T h i s Q r t r S a l e s A m o u n t   E l e m e n t T y p e = " C o l u m n "   E l e m e n t I d = " 1 2 5 5 1 5 6 9 6 6 "   D a t a T y p e = " D e c i m a l " > T h i s Q r t r S a l e s A m o u n t < / T h i s Q r t r S a l e s A m o u n t >   

</xml_diff>

<commit_message>
Comment box added to the Customer Statistcs report and annualized quote fiure field conevrted to Integer type
</commit_message>
<xml_diff>
--- a/src/Layouts/Customer.docx
+++ b/src/Layouts/Customer.docx
@@ -6929,6 +6929,8 @@
  
          < C i t y   E l e m e n t T y p e = " C o l u m n "   E l e m e n t I d = " 1 4 3 2 6 9 1 7 5 8 "   D a t a T y p e = " T e x t " > C i t y < / C i t y >   
+         < C o m m e n t s   E l e m e n t T y p e = " C o l u m n "   E l e m e n t I d = " 1 6 4 4 4 5 9 0 5 9 "   D a t a T y p e = " T e x t " > C o m m e n t s < / C o m m e n t s > + 
          < C o n t a c t N a m e   E l e m e n t T y p e = " C o l u m n "   E l e m e n t I d = " 1 9 9 7 0 3 4 8 4 2 "   D a t a T y p e = " T e x t " > C o n t a c t N a m e < / C o n t a c t N a m e >   
          < C o u n t r y R e g i o n C o d e   E l e m e n t T y p e = " C o l u m n "   E l e m e n t I d = " 1 4 5 3 2 4 6 3 2 "   D a t a T y p e = " C o d e " > C o u n t r y R e g i o n C o d e < / C o u n t r y R e g i o n C o d e > @@ -7043,6 +7045,8 @@
          < A d d r e s s > A d d r e s s < / A d d r e s s >   
          < C i t y > C i t y < / C i t y > + 
+         < C o m m e n t s > C o m m e n t s < / C o m m e n t s >   
          < C o n t a c t N a m e > C o n t a c t N a m e < / C o n t a c t N a m e >   

</xml_diff>

<commit_message>
5 Comments fields added in TP customer statistics - Tommy
</commit_message>
<xml_diff>
--- a/src/Layouts/Customer.docx
+++ b/src/Layouts/Customer.docx
@@ -6929,7 +6929,15 @@
  
          < C i t y   E l e m e n t T y p e = " C o l u m n "   E l e m e n t I d = " 1 4 3 2 6 9 1 7 5 8 "   D a t a T y p e = " T e x t " > C i t y < / C i t y >   
-         < C o m m e n t s   E l e m e n t T y p e = " C o l u m n "   E l e m e n t I d = " 1 6 4 4 4 5 9 0 5 9 "   D a t a T y p e = " T e x t " > C o m m e n t s < / C o m m e n t s > +         < C o m m e n t 1   E l e m e n t T y p e = " C o l u m n "   E l e m e n t I d = " 1 7 6 8 0 2 3 6 4 7 "   D a t a T y p e = " T e x t " > C o m m e n t 1 < / C o m m e n t 1 > + 
+         < C o m m e n t 2   E l e m e n t T y p e = " C o l u m n "   E l e m e n t I d = " 1 4 5 0 6 6 2 0 4 "   D a t a T y p e = " T e x t " > C o m m e n t 2 < / C o m m e n t 2 > + 
+         < C o m m e n t 3   E l e m e n t T y p e = " C o l u m n "   E l e m e n t I d = " 4 9 2 6 3 0 4 1 3 "   D a t a T y p e = " T e x t " > C o m m e n t 3 < / C o m m e n t 3 > + 
+         < C o m m e n t 4   E l e m e n t T y p e = " C o l u m n "   E l e m e n t I d = " 1 4 2 0 4 5 9 4 3 8 "   D a t a T y p e = " T e x t " > C o m m e n t 4 < / C o m m e n t 4 > + 
+         < C o m m e n t 5   E l e m e n t T y p e = " C o l u m n "   E l e m e n t I d = " 7 8 2 7 6 2 8 2 1 "   D a t a T y p e = " T e x t " > C o m m e n t 5 < / C o m m e n t 5 >   
          < C o n t a c t N a m e   E l e m e n t T y p e = " C o l u m n "   E l e m e n t I d = " 1 9 9 7 0 3 4 8 4 2 "   D a t a T y p e = " T e x t " > C o n t a c t N a m e < / C o n t a c t N a m e >   
@@ -7046,7 +7054,15 @@
  
          < C i t y > C i t y < / C i t y >   
-         < C o m m e n t s > C o m m e n t s < / C o m m e n t s > +         < C o m m e n t 1 > C o m m e n t 1 < / C o m m e n t 1 > + 
+         < C o m m e n t 2 > C o m m e n t 2 < / C o m m e n t 2 > + 
+         < C o m m e n t 3 > C o m m e n t 3 < / C o m m e n t 3 > + 
+         < C o m m e n t 4 > C o m m e n t 4 < / C o m m e n t 4 > + 
+         < C o m m e n t 5 > C o m m e n t 5 < / C o m m e n t 5 >   
          < C o n t a c t N a m e > C o n t a c t N a m e < / C o n t a c t N a m e >   

</xml_diff>

<commit_message>
TP Customer Statistics_Comments and Contact email added
</commit_message>
<xml_diff>
--- a/src/Layouts/Customer.docx
+++ b/src/Layouts/Customer.docx
@@ -6939,6 +6939,8 @@
  
          < C o m m e n t 5   E l e m e n t T y p e = " C o l u m n "   E l e m e n t I d = " 7 8 2 7 6 2 8 2 1 "   D a t a T y p e = " T e x t " > C o m m e n t 5 < / C o m m e n t 5 >   
+         < C o n t a c t E m a i l   E l e m e n t T y p e = " C o l u m n "   E l e m e n t I d = " 1 5 8 3 9 8 6 6 6 3 "   D a t a T y p e = " T e x t " > C o n t a c t E m a i l < / C o n t a c t E m a i l > + 
          < C o n t a c t N a m e   E l e m e n t T y p e = " C o l u m n "   E l e m e n t I d = " 1 9 9 7 0 3 4 8 4 2 "   D a t a T y p e = " T e x t " > C o n t a c t N a m e < / C o n t a c t N a m e >   
          < C o u n t r y R e g i o n C o d e   E l e m e n t T y p e = " C o l u m n "   E l e m e n t I d = " 1 4 5 3 2 4 6 3 2 "   D a t a T y p e = " C o d e " > C o u n t r y R e g i o n C o d e < / C o u n t r y R e g i o n C o d e > @@ -6948,6 +6950,8 @@
          < C u s t o m e r G r a d e   E l e m e n t T y p e = " C o l u m n "   E l e m e n t I d = " 4 8 4 1 3 1 5 9 6 "   D a t a T y p e = " C o d e " > C u s t o m e r G r a d e < / C u s t o m e r G r a d e >   
          < E M a i l   E l e m e n t T y p e = " C o l u m n "   E l e m e n t I d = " 6 7 4 8 6 3 5 3 5 "   D a t a T y p e = " T e x t " > E M a i l < / E M a i l > + 
+         < L a s t a p p o i n t m e n t d a t e   E l e m e n t T y p e = " C o l u m n "   E l e m e n t I d = " 7 5 0 3 6 4 1 3 2 "   D a t a T y p e = " D a t e " > L a s t a p p o i n t m e n t d a t e < / L a s t a p p o i n t m e n t d a t e >   
          < L a s t Q r t r S a l e s A m o u n t   E l e m e n t T y p e = " C o l u m n "   E l e m e n t I d = " 1 5 2 6 9 6 1 5 4 2 "   D a t a T y p e = " D e c i m a l " > L a s t Q r t r S a l e s A m o u n t < / L a s t Q r t r S a l e s A m o u n t >   
@@ -7064,6 +7068,8 @@
  
          < C o m m e n t 5 > C o m m e n t 5 < / C o m m e n t 5 >   
+         < C o n t a c t E m a i l > C o n t a c t E m a i l < / C o n t a c t E m a i l > + 
          < C o n t a c t N a m e > C o n t a c t N a m e < / C o n t a c t N a m e >   
          < C o u n t r y R e g i o n C o d e > C o u n t r y R e g i o n C o d e < / C o u n t r y R e g i o n C o d e > @@ -7073,6 +7079,8 @@
          < C u s t o m e r G r a d e > C u s t o m e r G r a d e < / C u s t o m e r G r a d e >   
          < E M a i l > E M a i l < / E M a i l > + 
+         < L a s t a p p o i n t m e n t d a t e > L a s t a p p o i n t m e n t d a t e < / L a s t a p p o i n t m e n t d a t e >   
          < L a s t Q r t r S a l e s A m o u n t > L a s t Q r t r S a l e s A m o u n t < / L a s t Q r t r S a l e s A m o u n t >   

</xml_diff>

<commit_message>
Readded the Bill to fields correctly in tax invoice report
</commit_message>
<xml_diff>
--- a/src/Layouts/Customer.docx
+++ b/src/Layouts/Customer.docx
@@ -26,6 +26,18 @@
  
          < C i t y > C i t y < / C i t y >   
+         < C o m m e n t 1 > C o m m e n t 1 < / C o m m e n t 1 > + 
+         < C o m m e n t 2 > C o m m e n t 2 < / C o m m e n t 2 > + 
+         < C o m m e n t 3 > C o m m e n t 3 < / C o m m e n t 3 > + 
+         < C o m m e n t 4 > C o m m e n t 4 < / C o m m e n t 4 > + 
+         < C o m m e n t 5 > C o m m e n t 5 < / C o m m e n t 5 > + 
+         < C o n t a c t E m a i l > C o n t a c t E m a i l < / C o n t a c t E m a i l > + 
          < C o n t a c t N a m e > C o n t a c t N a m e < / C o n t a c t N a m e >   
          < C o u n t r y R e g i o n C o d e > C o u n t r y R e g i o n C o d e < / C o u n t r y R e g i o n C o d e > @@ -37,6 +49,8 @@
          < C u s t o m e r _ G r a d e > C u s t o m e r _ G r a d e < / C u s t o m e r _ G r a d e >   
          < E M a i l > E M a i l < / E M a i l > + 
+         < L a s t a p p o i n t m e n t d a t e > L a s t a p p o i n t m e n t d a t e < / L a s t a p p o i n t m e n t d a t e >   
          < L a s t Q r t r S a l e s A m o u n t > L a s t Q r t r S a l e s A m o u n t < / L a s t Q r t r S a l e s A m o u n t >   
@@ -213,6 +227,18 @@
  
          < C i t y   E l e m e n t T y p e = " C o l u m n "   E l e m e n t I d = " 1 4 3 2 6 9 1 7 5 8 "   D a t a T y p e = " T e x t " > C i t y < / C i t y >   
+         < C o m m e n t 1   E l e m e n t T y p e = " C o l u m n "   E l e m e n t I d = " 1 7 6 8 0 2 3 6 4 7 "   D a t a T y p e = " T e x t " > C o m m e n t 1 < / C o m m e n t 1 > + 
+         < C o m m e n t 2   E l e m e n t T y p e = " C o l u m n "   E l e m e n t I d = " 1 4 5 0 6 6 2 0 4 "   D a t a T y p e = " T e x t " > C o m m e n t 2 < / C o m m e n t 2 > + 
+         < C o m m e n t 3   E l e m e n t T y p e = " C o l u m n "   E l e m e n t I d = " 4 9 2 6 3 0 4 1 3 "   D a t a T y p e = " T e x t " > C o m m e n t 3 < / C o m m e n t 3 > + 
+         < C o m m e n t 4   E l e m e n t T y p e = " C o l u m n "   E l e m e n t I d = " 1 4 2 0 4 5 9 4 3 8 "   D a t a T y p e = " T e x t " > C o m m e n t 4 < / C o m m e n t 4 > + 
+         < C o m m e n t 5   E l e m e n t T y p e = " C o l u m n "   E l e m e n t I d = " 7 8 2 7 6 2 8 2 1 "   D a t a T y p e = " T e x t " > C o m m e n t 5 < / C o m m e n t 5 > + 
+         < C o n t a c t E m a i l   E l e m e n t T y p e = " C o l u m n "   E l e m e n t I d = " 1 5 8 3 9 8 6 6 6 3 "   D a t a T y p e = " T e x t " > C o n t a c t E m a i l < / C o n t a c t E m a i l > + 
          < C o n t a c t N a m e   E l e m e n t T y p e = " C o l u m n "   E l e m e n t I d = " 1 9 9 7 0 3 4 8 4 2 "   D a t a T y p e = " T e x t " > C o n t a c t N a m e < / C o n t a c t N a m e >   
          < C o u n t r y R e g i o n C o d e   E l e m e n t T y p e = " C o l u m n "   E l e m e n t I d = " 1 4 5 3 2 4 6 3 2 "   D a t a T y p e = " C o d e " > C o u n t r y R e g i o n C o d e < / C o u n t r y R e g i o n C o d e > @@ -224,6 +250,8 @@
          < C u s t o m e r _ G r a d e   E l e m e n t T y p e = " C o l u m n "   E l e m e n t I d = " 1 3 6 1 0 1 2 0 1 9 "   D a t a T y p e = " C o d e " > C u s t o m e r _ G r a d e < / C u s t o m e r _ G r a d e >   
          < E M a i l   E l e m e n t T y p e = " C o l u m n "   E l e m e n t I d = " 6 7 4 8 6 3 5 3 5 "   D a t a T y p e = " T e x t " > E M a i l < / E M a i l > + 
+         < L a s t a p p o i n t m e n t d a t e   E l e m e n t T y p e = " C o l u m n "   E l e m e n t I d = " 7 5 0 3 6 4 1 3 2 "   D a t a T y p e = " D a t e " > L a s t a p p o i n t m e n t d a t e < / L a s t a p p o i n t m e n t d a t e >   
          < L a s t Q r t r S a l e s A m o u n t   E l e m e n t T y p e = " C o l u m n "   E l e m e n t I d = " 1 5 2 6 9 6 1 5 4 2 "   D a t a T y p e = " D e c i m a l " > L a s t Q r t r S a l e s A m o u n t < / L a s t Q r t r S a l e s A m o u n t >   

</xml_diff>